<commit_message>
Add chapter 2 manuscript and annotated code snippets
</commit_message>
<xml_diff>
--- a/chapters/01_엑스포로_Hello_World_만들기/manuscript/01_엑스포로_Hello_World_만들기.docx
+++ b/chapters/01_엑스포로_Hello_World_만들기/manuscript/01_엑스포로_Hello_World_만들기.docx
@@ -691,7 +691,17 @@
           <w:i w:val="0"/>
           <w:sz w:val="19"/>
         </w:rPr>
-        <w:t>export default function App() {</w:t>
+        <w:t xml:space="preserve">export default function App() {  </w:t>
+      </w:r>
+      <w:r>
+        <w:rPr>
+          <w:rFonts w:ascii="맑은 고딕" w:hAnsi="맑은 고딕" w:eastAsia="맑은 고딕" w:cs="맑은 고딕"/>
+          <w:b/>
+          <w:i w:val="0"/>
+          <w:color w:val="2563EB"/>
+          <w:sz w:val="23"/>
+        </w:rPr>
+        <w:t>①</w:t>
       </w:r>
     </w:p>
     <w:p>
@@ -733,7 +743,17 @@
           <w:i w:val="0"/>
           <w:sz w:val="19"/>
         </w:rPr>
-        <w:t xml:space="preserve">    &lt;View style={styles.container}&gt;</w:t>
+        <w:t xml:space="preserve">    &lt;View style={styles.container}&gt;  </w:t>
+      </w:r>
+      <w:r>
+        <w:rPr>
+          <w:rFonts w:ascii="맑은 고딕" w:hAnsi="맑은 고딕" w:eastAsia="맑은 고딕" w:cs="맑은 고딕"/>
+          <w:b/>
+          <w:i w:val="0"/>
+          <w:color w:val="2563EB"/>
+          <w:sz w:val="23"/>
+        </w:rPr>
+        <w:t>②</w:t>
       </w:r>
     </w:p>
     <w:p>
@@ -775,7 +795,17 @@
           <w:i w:val="0"/>
           <w:sz w:val="19"/>
         </w:rPr>
-        <w:t xml:space="preserve">      &lt;Text style={styles.title}&gt;Hello World&lt;/Text&gt;</w:t>
+        <w:t xml:space="preserve">      &lt;Text style={styles.title}&gt;Hello World&lt;/Text&gt;  </w:t>
+      </w:r>
+      <w:r>
+        <w:rPr>
+          <w:rFonts w:ascii="맑은 고딕" w:hAnsi="맑은 고딕" w:eastAsia="맑은 고딕" w:cs="맑은 고딕"/>
+          <w:b/>
+          <w:i w:val="0"/>
+          <w:color w:val="2563EB"/>
+          <w:sz w:val="23"/>
+        </w:rPr>
+        <w:t>③</w:t>
       </w:r>
     </w:p>
     <w:p>
@@ -817,7 +847,17 @@
           <w:i w:val="0"/>
           <w:sz w:val="19"/>
         </w:rPr>
-        <w:t xml:space="preserve">      &lt;Text style={styles.description}&gt;</w:t>
+        <w:t xml:space="preserve">      &lt;Text style={styles.description}&gt;  </w:t>
+      </w:r>
+      <w:r>
+        <w:rPr>
+          <w:rFonts w:ascii="맑은 고딕" w:hAnsi="맑은 고딕" w:eastAsia="맑은 고딕" w:cs="맑은 고딕"/>
+          <w:b/>
+          <w:i w:val="0"/>
+          <w:color w:val="2563EB"/>
+          <w:sz w:val="23"/>
+        </w:rPr>
+        <w:t>④</w:t>
       </w:r>
     </w:p>
     <w:p>
@@ -880,7 +920,17 @@
           <w:i w:val="0"/>
           <w:sz w:val="19"/>
         </w:rPr>
-        <w:t xml:space="preserve">      &lt;StatusBar style="auto" /&gt;</w:t>
+        <w:t xml:space="preserve">      &lt;StatusBar style="auto" /&gt;  </w:t>
+      </w:r>
+      <w:r>
+        <w:rPr>
+          <w:rFonts w:ascii="맑은 고딕" w:hAnsi="맑은 고딕" w:eastAsia="맑은 고딕" w:cs="맑은 고딕"/>
+          <w:b/>
+          <w:i w:val="0"/>
+          <w:color w:val="2563EB"/>
+          <w:sz w:val="23"/>
+        </w:rPr>
+        <w:t>⑤</w:t>
       </w:r>
     </w:p>
     <w:p>
@@ -1006,7 +1056,17 @@
           <w:i w:val="0"/>
           <w:sz w:val="19"/>
         </w:rPr>
-        <w:t xml:space="preserve">  container: {</w:t>
+        <w:t xml:space="preserve">  container: {  </w:t>
+      </w:r>
+      <w:r>
+        <w:rPr>
+          <w:rFonts w:ascii="맑은 고딕" w:hAnsi="맑은 고딕" w:eastAsia="맑은 고딕" w:cs="맑은 고딕"/>
+          <w:b/>
+          <w:i w:val="0"/>
+          <w:color w:val="2563EB"/>
+          <w:sz w:val="23"/>
+        </w:rPr>
+        <w:t>⑥</w:t>
       </w:r>
     </w:p>
     <w:p>
@@ -1727,6 +1787,168 @@
       <w:r>
         <w:rPr>
           <w:rFonts w:ascii="맑은 고딕" w:hAnsi="맑은 고딕" w:eastAsia="맑은 고딕" w:cs="맑은 고딕"/>
+          <w:b/>
+          <w:i w:val="0"/>
+          <w:color w:val="1A365D"/>
+          <w:sz w:val="22"/>
+        </w:rPr>
+        <w:t>코드 스니펫 해설</w:t>
+      </w:r>
+    </w:p>
+    <w:p>
+      <w:pPr>
+        <w:spacing w:after="80"/>
+        <w:ind w:left="227"/>
+      </w:pPr>
+      <w:r>
+        <w:rPr>
+          <w:rFonts w:ascii="맑은 고딕" w:hAnsi="맑은 고딕" w:eastAsia="맑은 고딕" w:cs="맑은 고딕"/>
+          <w:b/>
+          <w:i w:val="0"/>
+          <w:color w:val="1D4ED8"/>
+          <w:sz w:val="22"/>
+        </w:rPr>
+        <w:t xml:space="preserve">① </w:t>
+      </w:r>
+      <w:r>
+        <w:rPr>
+          <w:rFonts w:ascii="맑은 고딕" w:hAnsi="맑은 고딕" w:eastAsia="맑은 고딕" w:cs="맑은 고딕"/>
+          <w:b w:val="0"/>
+          <w:i w:val="0"/>
+          <w:sz w:val="22"/>
+        </w:rPr>
+        <w:t>App 컴포넌트는 이 예제의 진입점이다. React Native는 이 함수가 반환하는 JSX를 기준으로 첫 화면을 그리므로, 화면 구성을 읽을 때 가장 먼저 확인해야 하는 위치다.</w:t>
+      </w:r>
+    </w:p>
+    <w:p>
+      <w:pPr>
+        <w:spacing w:after="80"/>
+        <w:ind w:left="227"/>
+      </w:pPr>
+      <w:r>
+        <w:rPr>
+          <w:rFonts w:ascii="맑은 고딕" w:hAnsi="맑은 고딕" w:eastAsia="맑은 고딕" w:cs="맑은 고딕"/>
+          <w:b/>
+          <w:i w:val="0"/>
+          <w:color w:val="1D4ED8"/>
+          <w:sz w:val="22"/>
+        </w:rPr>
+        <w:t xml:space="preserve">② </w:t>
+      </w:r>
+      <w:r>
+        <w:rPr>
+          <w:rFonts w:ascii="맑은 고딕" w:hAnsi="맑은 고딕" w:eastAsia="맑은 고딕" w:cs="맑은 고딕"/>
+          <w:b w:val="0"/>
+          <w:i w:val="0"/>
+          <w:sz w:val="22"/>
+        </w:rPr>
+        <w:t>최상위 View는 화면 전체를 감싸는 컨테이너다. 자식 요소들의 정렬 기준이 여기서 결정되기 때문에, 레이아웃이 흐트러질 때는 이 블록의 스타일을 먼저 확인하는 습관이 중요하다.</w:t>
+      </w:r>
+    </w:p>
+    <w:p>
+      <w:pPr>
+        <w:spacing w:after="80"/>
+        <w:ind w:left="227"/>
+      </w:pPr>
+      <w:r>
+        <w:rPr>
+          <w:rFonts w:ascii="맑은 고딕" w:hAnsi="맑은 고딕" w:eastAsia="맑은 고딕" w:cs="맑은 고딕"/>
+          <w:b/>
+          <w:i w:val="0"/>
+          <w:color w:val="1D4ED8"/>
+          <w:sz w:val="22"/>
+        </w:rPr>
+        <w:t xml:space="preserve">③ </w:t>
+      </w:r>
+      <w:r>
+        <w:rPr>
+          <w:rFonts w:ascii="맑은 고딕" w:hAnsi="맑은 고딕" w:eastAsia="맑은 고딕" w:cs="맑은 고딕"/>
+          <w:b w:val="0"/>
+          <w:i w:val="0"/>
+          <w:sz w:val="22"/>
+        </w:rPr>
+        <w:t>Hello World 제목은 사용자가 앱을 실행했을 때 가장 먼저 인식하는 핵심 메시지다. 큰 글자와 굵은 두께를 적용해 화면의 시선을 모으고, 예제가 정상적으로 렌더링되었는지 바로 판단할 수 있게 한다.</w:t>
+      </w:r>
+    </w:p>
+    <w:p>
+      <w:pPr>
+        <w:spacing w:after="80"/>
+        <w:ind w:left="227"/>
+      </w:pPr>
+      <w:r>
+        <w:rPr>
+          <w:rFonts w:ascii="맑은 고딕" w:hAnsi="맑은 고딕" w:eastAsia="맑은 고딕" w:cs="맑은 고딕"/>
+          <w:b/>
+          <w:i w:val="0"/>
+          <w:color w:val="1D4ED8"/>
+          <w:sz w:val="22"/>
+        </w:rPr>
+        <w:t xml:space="preserve">④ </w:t>
+      </w:r>
+      <w:r>
+        <w:rPr>
+          <w:rFonts w:ascii="맑은 고딕" w:hAnsi="맑은 고딕" w:eastAsia="맑은 고딕" w:cs="맑은 고딕"/>
+          <w:b w:val="0"/>
+          <w:i w:val="0"/>
+          <w:sz w:val="22"/>
+        </w:rPr>
+        <w:t>설명 문장은 단순한 장식이 아니라 화면의 목적을 보완하는 역할을 한다. 실습 환경과 학습 목표를 함께 보여 주기 때문에, 독자는 지금 만든 앱이 무엇을 확인하려는 예제인지 즉시 이해할 수 있다.</w:t>
+      </w:r>
+    </w:p>
+    <w:p>
+      <w:pPr>
+        <w:spacing w:after="80"/>
+        <w:ind w:left="227"/>
+      </w:pPr>
+      <w:r>
+        <w:rPr>
+          <w:rFonts w:ascii="맑은 고딕" w:hAnsi="맑은 고딕" w:eastAsia="맑은 고딕" w:cs="맑은 고딕"/>
+          <w:b/>
+          <w:i w:val="0"/>
+          <w:color w:val="1D4ED8"/>
+          <w:sz w:val="22"/>
+        </w:rPr>
+        <w:t xml:space="preserve">⑤ </w:t>
+      </w:r>
+      <w:r>
+        <w:rPr>
+          <w:rFonts w:ascii="맑은 고딕" w:hAnsi="맑은 고딕" w:eastAsia="맑은 고딕" w:cs="맑은 고딕"/>
+          <w:b w:val="0"/>
+          <w:i w:val="0"/>
+          <w:sz w:val="22"/>
+        </w:rPr>
+        <w:t>StatusBar는 기기 상단 상태 표시줄의 표시 스타일을 현재 화면과 자연스럽게 맞춘다. 예제 규모가 작더라도 운영체제 UI와 앱 화면이 어색하게 분리되지 않도록 챙기는 기본 설정이라고 이해하면 좋다.</w:t>
+      </w:r>
+    </w:p>
+    <w:p>
+      <w:pPr>
+        <w:spacing w:after="80"/>
+        <w:ind w:left="227"/>
+      </w:pPr>
+      <w:r>
+        <w:rPr>
+          <w:rFonts w:ascii="맑은 고딕" w:hAnsi="맑은 고딕" w:eastAsia="맑은 고딕" w:cs="맑은 고딕"/>
+          <w:b/>
+          <w:i w:val="0"/>
+          <w:color w:val="1D4ED8"/>
+          <w:sz w:val="22"/>
+        </w:rPr>
+        <w:t xml:space="preserve">⑥ </w:t>
+      </w:r>
+      <w:r>
+        <w:rPr>
+          <w:rFonts w:ascii="맑은 고딕" w:hAnsi="맑은 고딕" w:eastAsia="맑은 고딕" w:cs="맑은 고딕"/>
+          <w:b w:val="0"/>
+          <w:i w:val="0"/>
+          <w:sz w:val="22"/>
+        </w:rPr>
+        <w:t>container 스타일은 중앙 정렬, 배경색, 좌우 여백처럼 화면의 전체 분위기를 결정하는 속성을 묶어 둔 곳이다. 레이아웃과 시각 스타일을 컴포넌트 바깥으로 분리해 두면 화면 구조와 디자인 역할이 나뉘어 유지보수가 쉬워진다.</w:t>
+      </w:r>
+    </w:p>
+    <w:p>
+      <w:r>
+        <w:rPr>
+          <w:rFonts w:ascii="맑은 고딕" w:hAnsi="맑은 고딕" w:eastAsia="맑은 고딕" w:cs="맑은 고딕"/>
           <w:b w:val="0"/>
           <w:i w:val="0"/>
           <w:sz w:val="22"/>

</xml_diff>